<commit_message>
Adiciona introducao sobre a atualizacao do Regimento Interno
Co-Authored-By: Claude Sonnet 5.5 <noreply@anthropic.com>
Claude-Session: https://claude.ai/code/session_012N7p3Pkv9x1s8c772a4kcY
</commit_message>
<xml_diff>
--- a/Item1_Organograma_Competencias_CENTRAL.docx
+++ b/Item1_Organograma_Competencias_CENTRAL.docx
@@ -66,6 +66,39 @@
           <w:szCs w:val="20"/>
         </w:rPr>
         <w:t xml:space="preserve">A estrutura segue o organograma do site da CENTRAL e as atualizações informadas pela CENTRAL; as competências vêm do Regimento Interno e do Estatuto Social. Os campos em amarelo (nomes, pontos focais, fundos) dependem de informação da CENTRAL.</w:t>
+      </w:r>
+    </w:p>
+    <w:p>
+      <w:pPr>
+        <w:pStyle w:val="Heading1"/>
+        <w:spacing w:after="120" w:before="240"/>
+      </w:pPr>
+      <w:r>
+        <w:t xml:space="preserve">Introdução</w:t>
+      </w:r>
+    </w:p>
+    <w:p>
+      <w:pPr>
+        <w:spacing w:after="100"/>
+      </w:pPr>
+      <w:r>
+        <w:rPr>
+          <w:sz w:val="21"/>
+          <w:szCs w:val="21"/>
+        </w:rPr>
+        <w:t xml:space="preserve">O Regimento Interno da CENTRAL, que dispõe sobre a estrutura organizacional e as competências de suas unidades, encontra-se em processo de atualização. Por isso, parte da estrutura em funcionamento ainda não está refletida no texto do Regimento vigente (versão de 2024).</w:t>
+      </w:r>
+    </w:p>
+    <w:p>
+      <w:pPr>
+        <w:spacing w:after="160"/>
+      </w:pPr>
+      <w:r>
+        <w:rPr>
+          <w:sz w:val="21"/>
+          <w:szCs w:val="21"/>
+        </w:rPr>
+        <w:t xml:space="preserve">Para responder ao item 1 do Ofício nº 02/2026 da Equipe de Transição, este documento adota o seguinte critério: a estrutura organizacional (organograma) segue a configuração atual, divulgada no site da CENTRAL e confirmada pela própria Companhia. Já as competências das unidades são as constantes do Regimento Interno e do Estatuto Social vigentes. Nas unidades criadas ou renomeadas após o Regimento (Corregedoria, Assessoria de Comunicação Social e Assessoria de Serviço Social, Segurança e Medicina do Trabalho), as competências ainda não estão formalizadas e serão atualizadas com a conclusão da revisão do Regimento.</w:t>
       </w:r>
     </w:p>
     <w:p>

</xml_diff>